<commit_message>
updated with frontent and fast api integration
</commit_message>
<xml_diff>
--- a/report.docx
+++ b/report.docx
@@ -15,6 +15,15 @@
           <w:color w:val="auto"/>
         </w:rPr>
         <w:t>Intrusion Detection System using Machine Learning</w:t>
+      </w:r>
+    </w:p>
+    <w:p/>
+    <w:p>
+      <w:r>
+        <w:t xml:space="preserve">Github link: </w:t>
+      </w:r>
+      <w:r>
+        <w:t>https://github.com/raffaysm/CLO4-IDS-ML-Solution-</w:t>
       </w:r>
     </w:p>
     <w:p/>

</xml_diff>